<commit_message>
Fix cover letter wording and regenerate BMC HSR submission package
Co-Authored-By: Tatsuki Onishi <bougtoir@gmail.com>
</commit_message>
<xml_diff>
--- a/documents/BMC_HSR/cover_letter_BMC_HSR_EN.docx
+++ b/documents/BMC_HSR/cover_letter_BMC_HSR_EN.docx
@@ -160,7 +160,7 @@
           <w:i w:val="0"/>
           <w:sz w:val="24"/>
         </w:rPr>
-        <w:t>The manuscript is original, has not been previously published and is not under consideration for publication elsewhere. All authors have read and approved the submitted manuscript and have agreed to its submission to BMC Health Services Research. The study used publicly available aggregate data only; ethics committee approval was not required under the Japanese Ethical Guidelines for Medical and Biological Research Involving Human Subjects (2021 revision). The reporting follows the STROBE checklist for cross-sectional studies, which is uploaded as supplementary material. A Highlights file is also provided as optional supplementary material.</w:t>
+        <w:t>The manuscript is original, has not been previously published and is not under consideration for publication elsewhere. All authors have read and approved the submitted manuscript and have agreed to its submission to BMC Health Services Research. The study used publicly available aggregate data only; ethics committee approval was not required under the Japanese Ethical Guidelines for Medical and Biological Research Involving Human Subjects (2021 revision). The reporting follows the STROBE checklist for cross-sectional studies, which is uploaded as supplementary material.</w:t>
       </w:r>
     </w:p>
     <w:p>
@@ -182,7 +182,7 @@
           <w:i w:val="0"/>
           <w:sz w:val="24"/>
         </w:rPr>
-        <w:t>The manuscript is formatted for BMC Health Services Research (main text approximately 3558 words; structured abstract 247 words, within the 350-word limit; 2 tables and 2 figures; 25 references). We have uploaded a separate title page, the anonymised main manuscript, separate editable tables and figures, and the STROBE checklist. A Highlights file is also provided as supplementary material.</w:t>
+        <w:t>The manuscript is formatted for BMC Health Services Research (main text approximately 3558 words; structured abstract 247 words, within the 350-word limit; 2 tables and 2 figures; 25 references). We have uploaded a separate title page, the anonymised main manuscript, separate tables, high-resolution figure files, and the STROBE checklist. A Highlights file is also provided as supplementary material.</w:t>
       </w:r>
     </w:p>
     <w:p>

</xml_diff>